<commit_message>
Business Partner & COA
</commit_message>
<xml_diff>
--- a/AP/ຄູ່ມື AP/ຄູ່ມືການ Reconciliation.docx
+++ b/AP/ຄູ່ມື AP/ຄູ່ມືການ Reconciliation.docx
@@ -1196,86 +1196,13 @@
         <mc:AlternateContent>
           <mc:Choice Requires="wps">
             <w:drawing>
-              <wp:anchor distT="0" distB="0" distL="114300" distR="114300" simplePos="0" relativeHeight="251696128" behindDoc="0" locked="0" layoutInCell="1" allowOverlap="1" wp14:anchorId="398F2263" wp14:editId="70699325">
+              <wp:anchor distT="0" distB="0" distL="114300" distR="114300" simplePos="0" relativeHeight="251697152" behindDoc="0" locked="0" layoutInCell="1" allowOverlap="1" wp14:anchorId="42CACA19" wp14:editId="23FA4F55">
                 <wp:simplePos x="0" y="0"/>
                 <wp:positionH relativeFrom="column">
-                  <wp:posOffset>1855682</wp:posOffset>
+                  <wp:posOffset>2325733</wp:posOffset>
                 </wp:positionH>
                 <wp:positionV relativeFrom="paragraph">
-                  <wp:posOffset>547582</wp:posOffset>
-                </wp:positionV>
-                <wp:extent cx="444500" cy="105833"/>
-                <wp:effectExtent l="38100" t="57150" r="12700" b="27940"/>
-                <wp:wrapNone/>
-                <wp:docPr id="926397144" name="Straight Arrow Connector 11"/>
-                <wp:cNvGraphicFramePr/>
-                <a:graphic xmlns:a="http://schemas.openxmlformats.org/drawingml/2006/main">
-                  <a:graphicData uri="http://schemas.microsoft.com/office/word/2010/wordprocessingShape">
-                    <wps:wsp>
-                      <wps:cNvCnPr/>
-                      <wps:spPr>
-                        <a:xfrm flipH="1" flipV="1">
-                          <a:off x="0" y="0"/>
-                          <a:ext cx="444500" cy="105833"/>
-                        </a:xfrm>
-                        <a:prstGeom prst="straightConnector1">
-                          <a:avLst/>
-                        </a:prstGeom>
-                        <a:ln>
-                          <a:solidFill>
-                            <a:srgbClr val="EE0000"/>
-                          </a:solidFill>
-                          <a:tailEnd type="triangle"/>
-                        </a:ln>
-                      </wps:spPr>
-                      <wps:style>
-                        <a:lnRef idx="2">
-                          <a:schemeClr val="accent1"/>
-                        </a:lnRef>
-                        <a:fillRef idx="0">
-                          <a:schemeClr val="accent1"/>
-                        </a:fillRef>
-                        <a:effectRef idx="1">
-                          <a:schemeClr val="accent1"/>
-                        </a:effectRef>
-                        <a:fontRef idx="minor">
-                          <a:schemeClr val="tx1"/>
-                        </a:fontRef>
-                      </wps:style>
-                      <wps:bodyPr/>
-                    </wps:wsp>
-                  </a:graphicData>
-                </a:graphic>
-              </wp:anchor>
-            </w:drawing>
-          </mc:Choice>
-          <mc:Fallback>
-            <w:pict>
-              <v:shapetype w14:anchorId="3988BD04" id="_x0000_t32" coordsize="21600,21600" o:spt="32" o:oned="t" path="m,l21600,21600e" filled="f">
-                <v:path arrowok="t" fillok="f" o:connecttype="none"/>
-                <o:lock v:ext="edit" shapetype="t"/>
-              </v:shapetype>
-              <v:shape id="Straight Arrow Connector 11" o:spid="_x0000_s1026" type="#_x0000_t32" style="position:absolute;margin-left:146.1pt;margin-top:43.1pt;width:35pt;height:8.35pt;flip:x y;z-index:251696128;visibility:visible;mso-wrap-style:square;mso-wrap-distance-left:9pt;mso-wrap-distance-top:0;mso-wrap-distance-right:9pt;mso-wrap-distance-bottom:0;mso-position-horizontal:absolute;mso-position-horizontal-relative:text;mso-position-vertical:absolute;mso-position-vertical-relative:text" o:gfxdata="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" strokecolor="#e00" strokeweight="1.5pt">
-                <v:stroke endarrow="block" joinstyle="miter"/>
-              </v:shape>
-            </w:pict>
-          </mc:Fallback>
-        </mc:AlternateContent>
-      </w:r>
-      <w:r>
-        <w:rPr>
-          <w:noProof/>
-        </w:rPr>
-        <mc:AlternateContent>
-          <mc:Choice Requires="wps">
-            <w:drawing>
-              <wp:anchor distT="0" distB="0" distL="114300" distR="114300" simplePos="0" relativeHeight="251697152" behindDoc="0" locked="0" layoutInCell="1" allowOverlap="1" wp14:anchorId="42CACA19" wp14:editId="1CB1FAF7">
-                <wp:simplePos x="0" y="0"/>
-                <wp:positionH relativeFrom="column">
-                  <wp:posOffset>1999615</wp:posOffset>
-                </wp:positionH>
-                <wp:positionV relativeFrom="paragraph">
-                  <wp:posOffset>653415</wp:posOffset>
+                  <wp:posOffset>533673</wp:posOffset>
                 </wp:positionV>
                 <wp:extent cx="2188633" cy="347133"/>
                 <wp:effectExtent l="0" t="0" r="21590" b="15240"/>
@@ -1367,7 +1294,7 @@
                 <v:stroke joinstyle="miter"/>
                 <v:path gradientshapeok="t" o:connecttype="rect"/>
               </v:shapetype>
-              <v:shape id="Text Box 4" o:spid="_x0000_s1026" type="#_x0000_t202" style="position:absolute;margin-left:157.45pt;margin-top:51.45pt;width:172.35pt;height:27.35pt;z-index:251697152;visibility:visible;mso-wrap-style:square;mso-width-percent:0;mso-height-percent:0;mso-wrap-distance-left:9pt;mso-wrap-distance-top:0;mso-wrap-distance-right:9pt;mso-wrap-distance-bottom:0;mso-position-horizontal:absolute;mso-position-horizontal-relative:text;mso-position-vertical:absolute;mso-position-vertical-relative:text;mso-width-percent:0;mso-height-percent:0;mso-width-relative:margin;mso-height-relative:margin;v-text-anchor:top" o:gfxdata="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" fillcolor="white [3201]" strokeweight=".5pt">
+              <v:shape id="Text Box 4" o:spid="_x0000_s1026" type="#_x0000_t202" style="position:absolute;margin-left:183.15pt;margin-top:42pt;width:172.35pt;height:27.35pt;z-index:251697152;visibility:visible;mso-wrap-style:square;mso-width-percent:0;mso-height-percent:0;mso-wrap-distance-left:9pt;mso-wrap-distance-top:0;mso-wrap-distance-right:9pt;mso-wrap-distance-bottom:0;mso-position-horizontal:absolute;mso-position-horizontal-relative:text;mso-position-vertical:absolute;mso-position-vertical-relative:text;mso-width-percent:0;mso-height-percent:0;mso-width-relative:margin;mso-height-relative:margin;v-text-anchor:top" o:gfxdata="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" fillcolor="white [3201]" strokeweight=".5pt">
                 <v:textbox>
                   <w:txbxContent>
                     <w:p>
@@ -1420,6 +1347,79 @@
         <mc:AlternateContent>
           <mc:Choice Requires="wps">
             <w:drawing>
+              <wp:anchor distT="0" distB="0" distL="114300" distR="114300" simplePos="0" relativeHeight="251696128" behindDoc="0" locked="0" layoutInCell="1" allowOverlap="1" wp14:anchorId="398F2263" wp14:editId="5CEE751C">
+                <wp:simplePos x="0" y="0"/>
+                <wp:positionH relativeFrom="column">
+                  <wp:posOffset>1855682</wp:posOffset>
+                </wp:positionH>
+                <wp:positionV relativeFrom="paragraph">
+                  <wp:posOffset>547582</wp:posOffset>
+                </wp:positionV>
+                <wp:extent cx="444500" cy="105833"/>
+                <wp:effectExtent l="38100" t="57150" r="12700" b="27940"/>
+                <wp:wrapNone/>
+                <wp:docPr id="926397144" name="Straight Arrow Connector 11"/>
+                <wp:cNvGraphicFramePr/>
+                <a:graphic xmlns:a="http://schemas.openxmlformats.org/drawingml/2006/main">
+                  <a:graphicData uri="http://schemas.microsoft.com/office/word/2010/wordprocessingShape">
+                    <wps:wsp>
+                      <wps:cNvCnPr/>
+                      <wps:spPr>
+                        <a:xfrm flipH="1" flipV="1">
+                          <a:off x="0" y="0"/>
+                          <a:ext cx="444500" cy="105833"/>
+                        </a:xfrm>
+                        <a:prstGeom prst="straightConnector1">
+                          <a:avLst/>
+                        </a:prstGeom>
+                        <a:ln>
+                          <a:solidFill>
+                            <a:srgbClr val="EE0000"/>
+                          </a:solidFill>
+                          <a:tailEnd type="triangle"/>
+                        </a:ln>
+                      </wps:spPr>
+                      <wps:style>
+                        <a:lnRef idx="2">
+                          <a:schemeClr val="accent1"/>
+                        </a:lnRef>
+                        <a:fillRef idx="0">
+                          <a:schemeClr val="accent1"/>
+                        </a:fillRef>
+                        <a:effectRef idx="1">
+                          <a:schemeClr val="accent1"/>
+                        </a:effectRef>
+                        <a:fontRef idx="minor">
+                          <a:schemeClr val="tx1"/>
+                        </a:fontRef>
+                      </wps:style>
+                      <wps:bodyPr/>
+                    </wps:wsp>
+                  </a:graphicData>
+                </a:graphic>
+              </wp:anchor>
+            </w:drawing>
+          </mc:Choice>
+          <mc:Fallback>
+            <w:pict>
+              <v:shapetype w14:anchorId="327FAEB2" id="_x0000_t32" coordsize="21600,21600" o:spt="32" o:oned="t" path="m,l21600,21600e" filled="f">
+                <v:path arrowok="t" fillok="f" o:connecttype="none"/>
+                <o:lock v:ext="edit" shapetype="t"/>
+              </v:shapetype>
+              <v:shape id="Straight Arrow Connector 11" o:spid="_x0000_s1026" type="#_x0000_t32" style="position:absolute;margin-left:146.1pt;margin-top:43.1pt;width:35pt;height:8.35pt;flip:x y;z-index:251696128;visibility:visible;mso-wrap-style:square;mso-wrap-distance-left:9pt;mso-wrap-distance-top:0;mso-wrap-distance-right:9pt;mso-wrap-distance-bottom:0;mso-position-horizontal:absolute;mso-position-horizontal-relative:text;mso-position-vertical:absolute;mso-position-vertical-relative:text" o:gfxdata="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" strokecolor="#e00" strokeweight="1.5pt">
+                <v:stroke endarrow="block" joinstyle="miter"/>
+              </v:shape>
+            </w:pict>
+          </mc:Fallback>
+        </mc:AlternateContent>
+      </w:r>
+      <w:r>
+        <w:rPr>
+          <w:noProof/>
+        </w:rPr>
+        <mc:AlternateContent>
+          <mc:Choice Requires="wps">
+            <w:drawing>
               <wp:anchor distT="0" distB="0" distL="114300" distR="114300" simplePos="0" relativeHeight="251679744" behindDoc="0" locked="0" layoutInCell="1" allowOverlap="1" wp14:anchorId="2A5AE0D6" wp14:editId="4D7B2975">
                 <wp:simplePos x="0" y="0"/>
                 <wp:positionH relativeFrom="column">
@@ -1529,6 +1529,14 @@
       </w:r>
     </w:p>
     <w:p>
+      <w:pPr>
+        <w:rPr>
+          <w:rFonts w:cs="DokChampa" w:hint="cs"/>
+          <w:szCs w:val="24"/>
+          <w:cs/>
+          <w:lang w:bidi="lo-LA"/>
+        </w:rPr>
+      </w:pPr>
       <w:r>
         <w:rPr>
           <w:noProof/>
@@ -1536,7 +1544,121 @@
         <mc:AlternateContent>
           <mc:Choice Requires="wps">
             <w:drawing>
-              <wp:anchor distT="0" distB="0" distL="114300" distR="114300" simplePos="0" relativeHeight="251700224" behindDoc="0" locked="0" layoutInCell="1" allowOverlap="1" wp14:anchorId="2F6AABFC" wp14:editId="28E45C61">
+              <wp:anchor distT="0" distB="0" distL="114300" distR="114300" simplePos="0" relativeHeight="251698176" behindDoc="0" locked="0" layoutInCell="1" allowOverlap="1" wp14:anchorId="5A0DC41F" wp14:editId="7A298EB3">
+                <wp:simplePos x="0" y="0"/>
+                <wp:positionH relativeFrom="margin">
+                  <wp:posOffset>-106499</wp:posOffset>
+                </wp:positionH>
+                <wp:positionV relativeFrom="paragraph">
+                  <wp:posOffset>440508</wp:posOffset>
+                </wp:positionV>
+                <wp:extent cx="206828" cy="223157"/>
+                <wp:effectExtent l="0" t="0" r="0" b="5715"/>
+                <wp:wrapNone/>
+                <wp:docPr id="2145739764" name="Text Box 12"/>
+                <wp:cNvGraphicFramePr/>
+                <a:graphic xmlns:a="http://schemas.openxmlformats.org/drawingml/2006/main">
+                  <a:graphicData uri="http://schemas.microsoft.com/office/word/2010/wordprocessingShape">
+                    <wps:wsp>
+                      <wps:cNvSpPr txBox="1"/>
+                      <wps:spPr>
+                        <a:xfrm>
+                          <a:off x="0" y="0"/>
+                          <a:ext cx="206828" cy="223157"/>
+                        </a:xfrm>
+                        <a:prstGeom prst="rect">
+                          <a:avLst/>
+                        </a:prstGeom>
+                        <a:noFill/>
+                        <a:ln w="6350">
+                          <a:noFill/>
+                        </a:ln>
+                      </wps:spPr>
+                      <wps:txbx>
+                        <w:txbxContent>
+                          <w:p>
+                            <w:pPr>
+                              <w:rPr>
+                                <w:rFonts w:ascii="Times New Roman" w:hAnsi="Times New Roman" w:cs="Times New Roman"/>
+                                <w:color w:val="EE0000"/>
+                                <w:sz w:val="14"/>
+                                <w:szCs w:val="18"/>
+                                <w:lang w:bidi="lo-LA"/>
+                              </w:rPr>
+                            </w:pPr>
+                            <w:r>
+                              <w:rPr>
+                                <w:rFonts w:ascii="Times New Roman" w:hAnsi="Times New Roman" w:cs="Times New Roman"/>
+                                <w:color w:val="EE0000"/>
+                                <w:sz w:val="14"/>
+                                <w:szCs w:val="18"/>
+                                <w:lang w:bidi="lo-LA"/>
+                              </w:rPr>
+                              <w:t>1</w:t>
+                            </w:r>
+                          </w:p>
+                        </w:txbxContent>
+                      </wps:txbx>
+                      <wps:bodyPr rot="0" spcFirstLastPara="0" vertOverflow="overflow" horzOverflow="overflow" vert="horz" wrap="square" lIns="91440" tIns="45720" rIns="91440" bIns="45720" numCol="1" spcCol="0" rtlCol="0" fromWordArt="0" anchor="t" anchorCtr="0" forceAA="0" compatLnSpc="1">
+                        <a:prstTxWarp prst="textNoShape">
+                          <a:avLst/>
+                        </a:prstTxWarp>
+                        <a:noAutofit/>
+                      </wps:bodyPr>
+                    </wps:wsp>
+                  </a:graphicData>
+                </a:graphic>
+                <wp14:sizeRelH relativeFrom="margin">
+                  <wp14:pctWidth>0</wp14:pctWidth>
+                </wp14:sizeRelH>
+                <wp14:sizeRelV relativeFrom="margin">
+                  <wp14:pctHeight>0</wp14:pctHeight>
+                </wp14:sizeRelV>
+              </wp:anchor>
+            </w:drawing>
+          </mc:Choice>
+          <mc:Fallback>
+            <w:pict>
+              <v:shape w14:anchorId="5A0DC41F" id="Text Box 12" o:spid="_x0000_s1027" type="#_x0000_t202" style="position:absolute;margin-left:-8.4pt;margin-top:34.7pt;width:16.3pt;height:17.55pt;z-index:251698176;visibility:visible;mso-wrap-style:square;mso-width-percent:0;mso-height-percent:0;mso-wrap-distance-left:9pt;mso-wrap-distance-top:0;mso-wrap-distance-right:9pt;mso-wrap-distance-bottom:0;mso-position-horizontal:absolute;mso-position-horizontal-relative:margin;mso-position-vertical:absolute;mso-position-vertical-relative:text;mso-width-percent:0;mso-height-percent:0;mso-width-relative:margin;mso-height-relative:margin;v-text-anchor:top" o:gfxdata="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" filled="f" stroked="f" strokeweight=".5pt">
+                <v:textbox>
+                  <w:txbxContent>
+                    <w:p>
+                      <w:pPr>
+                        <w:rPr>
+                          <w:rFonts w:ascii="Times New Roman" w:hAnsi="Times New Roman" w:cs="Times New Roman"/>
+                          <w:color w:val="EE0000"/>
+                          <w:sz w:val="14"/>
+                          <w:szCs w:val="18"/>
+                          <w:lang w:bidi="lo-LA"/>
+                        </w:rPr>
+                      </w:pPr>
+                      <w:r>
+                        <w:rPr>
+                          <w:rFonts w:ascii="Times New Roman" w:hAnsi="Times New Roman" w:cs="Times New Roman"/>
+                          <w:color w:val="EE0000"/>
+                          <w:sz w:val="14"/>
+                          <w:szCs w:val="18"/>
+                          <w:lang w:bidi="lo-LA"/>
+                        </w:rPr>
+                        <w:t>1</w:t>
+                      </w:r>
+                    </w:p>
+                  </w:txbxContent>
+                </v:textbox>
+                <w10:wrap anchorx="margin"/>
+              </v:shape>
+            </w:pict>
+          </mc:Fallback>
+        </mc:AlternateContent>
+      </w:r>
+      <w:r>
+        <w:rPr>
+          <w:noProof/>
+        </w:rPr>
+        <mc:AlternateContent>
+          <mc:Choice Requires="wps">
+            <w:drawing>
+              <wp:anchor distT="0" distB="0" distL="114300" distR="114300" simplePos="0" relativeHeight="251700224" behindDoc="0" locked="0" layoutInCell="1" allowOverlap="1" wp14:anchorId="2F6AABFC" wp14:editId="635C3DE7">
                 <wp:simplePos x="0" y="0"/>
                 <wp:positionH relativeFrom="margin">
                   <wp:posOffset>5009303</wp:posOffset>
@@ -1669,7 +1791,7 @@
           </mc:Choice>
           <mc:Fallback>
             <w:pict>
-              <v:shape w14:anchorId="2F6AABFC" id="Text Box 12" o:spid="_x0000_s1027" type="#_x0000_t202" style="position:absolute;margin-left:394.45pt;margin-top:189.45pt;width:14pt;height:14.35pt;z-index:251700224;visibility:visible;mso-wrap-style:square;mso-width-percent:0;mso-height-percent:0;mso-wrap-distance-left:9pt;mso-wrap-distance-top:0;mso-wrap-distance-right:9pt;mso-wrap-distance-bottom:0;mso-position-horizontal:absolute;mso-position-horizontal-relative:margin;mso-position-vertical:absolute;mso-position-vertical-relative:text;mso-width-percent:0;mso-height-percent:0;mso-width-relative:margin;mso-height-relative:margin;v-text-anchor:top" o:gfxdata="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" filled="f" stroked="f" strokeweight=".5pt">
+              <v:shape w14:anchorId="2F6AABFC" id="_x0000_s1028" type="#_x0000_t202" style="position:absolute;margin-left:394.45pt;margin-top:189.45pt;width:14pt;height:14.35pt;z-index:251700224;visibility:visible;mso-wrap-style:square;mso-width-percent:0;mso-height-percent:0;mso-wrap-distance-left:9pt;mso-wrap-distance-top:0;mso-wrap-distance-right:9pt;mso-wrap-distance-bottom:0;mso-position-horizontal:absolute;mso-position-horizontal-relative:margin;mso-position-vertical:absolute;mso-position-vertical-relative:text;mso-width-percent:0;mso-height-percent:0;mso-width-relative:margin;mso-height-relative:margin;v-text-anchor:top" o:gfxdata="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" filled="f" stroked="f" strokeweight=".5pt">
                 <v:textbox>
                   <w:txbxContent>
                     <w:p>
@@ -1749,120 +1871,6 @@
                             </a:graphic>
                           </wp:inline>
                         </w:drawing>
-                      </w:r>
-                    </w:p>
-                  </w:txbxContent>
-                </v:textbox>
-                <w10:wrap anchorx="margin"/>
-              </v:shape>
-            </w:pict>
-          </mc:Fallback>
-        </mc:AlternateContent>
-      </w:r>
-      <w:r>
-        <w:rPr>
-          <w:noProof/>
-        </w:rPr>
-        <mc:AlternateContent>
-          <mc:Choice Requires="wps">
-            <w:drawing>
-              <wp:anchor distT="0" distB="0" distL="114300" distR="114300" simplePos="0" relativeHeight="251698176" behindDoc="0" locked="0" layoutInCell="1" allowOverlap="1" wp14:anchorId="5A0DC41F" wp14:editId="60FA90C0">
-                <wp:simplePos x="0" y="0"/>
-                <wp:positionH relativeFrom="margin">
-                  <wp:posOffset>-88900</wp:posOffset>
-                </wp:positionH>
-                <wp:positionV relativeFrom="paragraph">
-                  <wp:posOffset>463339</wp:posOffset>
-                </wp:positionV>
-                <wp:extent cx="177800" cy="182033"/>
-                <wp:effectExtent l="0" t="0" r="0" b="0"/>
-                <wp:wrapNone/>
-                <wp:docPr id="2145739764" name="Text Box 12"/>
-                <wp:cNvGraphicFramePr/>
-                <a:graphic xmlns:a="http://schemas.openxmlformats.org/drawingml/2006/main">
-                  <a:graphicData uri="http://schemas.microsoft.com/office/word/2010/wordprocessingShape">
-                    <wps:wsp>
-                      <wps:cNvSpPr txBox="1"/>
-                      <wps:spPr>
-                        <a:xfrm>
-                          <a:off x="0" y="0"/>
-                          <a:ext cx="177800" cy="182033"/>
-                        </a:xfrm>
-                        <a:prstGeom prst="rect">
-                          <a:avLst/>
-                        </a:prstGeom>
-                        <a:noFill/>
-                        <a:ln w="6350">
-                          <a:noFill/>
-                        </a:ln>
-                      </wps:spPr>
-                      <wps:txbx>
-                        <w:txbxContent>
-                          <w:p>
-                            <w:pPr>
-                              <w:rPr>
-                                <w:rFonts w:ascii="Times New Roman" w:hAnsi="Times New Roman" w:cs="Times New Roman"/>
-                                <w:color w:val="EE0000"/>
-                                <w:sz w:val="14"/>
-                                <w:szCs w:val="18"/>
-                                <w:lang w:bidi="lo-LA"/>
-                              </w:rPr>
-                            </w:pPr>
-                            <w:r>
-                              <w:rPr>
-                                <w:rFonts w:ascii="Times New Roman" w:hAnsi="Times New Roman" w:cs="Times New Roman"/>
-                                <w:color w:val="EE0000"/>
-                                <w:sz w:val="14"/>
-                                <w:szCs w:val="18"/>
-                                <w:lang w:bidi="lo-LA"/>
-                              </w:rPr>
-                              <w:t>1</w:t>
-                            </w:r>
-                          </w:p>
-                        </w:txbxContent>
-                      </wps:txbx>
-                      <wps:bodyPr rot="0" spcFirstLastPara="0" vertOverflow="overflow" horzOverflow="overflow" vert="horz" wrap="square" lIns="91440" tIns="45720" rIns="91440" bIns="45720" numCol="1" spcCol="0" rtlCol="0" fromWordArt="0" anchor="t" anchorCtr="0" forceAA="0" compatLnSpc="1">
-                        <a:prstTxWarp prst="textNoShape">
-                          <a:avLst/>
-                        </a:prstTxWarp>
-                        <a:noAutofit/>
-                      </wps:bodyPr>
-                    </wps:wsp>
-                  </a:graphicData>
-                </a:graphic>
-                <wp14:sizeRelH relativeFrom="margin">
-                  <wp14:pctWidth>0</wp14:pctWidth>
-                </wp14:sizeRelH>
-                <wp14:sizeRelV relativeFrom="margin">
-                  <wp14:pctHeight>0</wp14:pctHeight>
-                </wp14:sizeRelV>
-              </wp:anchor>
-            </w:drawing>
-          </mc:Choice>
-          <mc:Fallback>
-            <w:pict>
-              <v:shape w14:anchorId="5A0DC41F" id="_x0000_s1028" type="#_x0000_t202" style="position:absolute;margin-left:-7pt;margin-top:36.5pt;width:14pt;height:14.35pt;z-index:251698176;visibility:visible;mso-wrap-style:square;mso-width-percent:0;mso-height-percent:0;mso-wrap-distance-left:9pt;mso-wrap-distance-top:0;mso-wrap-distance-right:9pt;mso-wrap-distance-bottom:0;mso-position-horizontal:absolute;mso-position-horizontal-relative:margin;mso-position-vertical:absolute;mso-position-vertical-relative:text;mso-width-percent:0;mso-height-percent:0;mso-width-relative:margin;mso-height-relative:margin;v-text-anchor:top" o:gfxdata="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" filled="f" stroked="f" strokeweight=".5pt">
-                <v:textbox>
-                  <w:txbxContent>
-                    <w:p>
-                      <w:pPr>
-                        <w:rPr>
-                          <w:rFonts w:ascii="Times New Roman" w:hAnsi="Times New Roman" w:cs="Times New Roman"/>
-                          <w:color w:val="EE0000"/>
-                          <w:sz w:val="14"/>
-                          <w:szCs w:val="18"/>
-                          <w:lang w:bidi="lo-LA"/>
-                        </w:rPr>
-                      </w:pPr>
-                      <w:r>
-                        <w:rPr>
-                          <w:rFonts w:ascii="Times New Roman" w:hAnsi="Times New Roman" w:cs="Times New Roman"/>
-                          <w:color w:val="EE0000"/>
-                          <w:sz w:val="14"/>
-                          <w:szCs w:val="18"/>
-                          <w:lang w:bidi="lo-LA"/>
-                        </w:rPr>
-                        <w:t>1</w:t>
                       </w:r>
                     </w:p>
                   </w:txbxContent>
@@ -4243,7 +4251,22 @@
     <w:p/>
     <w:p/>
     <w:p/>
-    <w:p/>
+    <w:p>
+      <w:pPr>
+        <w:tabs>
+          <w:tab w:val="left" w:pos="5871"/>
+        </w:tabs>
+        <w:rPr>
+          <w:rFonts w:ascii="Phetsarath OT" w:eastAsia="Phetsarath OT" w:hAnsi="Phetsarath OT" w:cs="Phetsarath OT" w:hint="cs"/>
+          <w:szCs w:val="24"/>
+          <w:cs/>
+          <w:lang w:bidi="lo-LA"/>
+        </w:rPr>
+      </w:pPr>
+      <w:r>
+        <w:tab/>
+      </w:r>
+    </w:p>
     <w:p/>
     <w:p/>
     <w:p/>
@@ -4258,7 +4281,7 @@
           <w:noProof/>
         </w:rPr>
         <w:drawing>
-          <wp:anchor distT="0" distB="0" distL="114300" distR="114300" simplePos="0" relativeHeight="251717632" behindDoc="1" locked="0" layoutInCell="1" allowOverlap="1" wp14:anchorId="4587E199" wp14:editId="3DA68AC3">
+          <wp:anchor distT="0" distB="0" distL="114300" distR="114300" simplePos="0" relativeHeight="251717632" behindDoc="1" locked="0" layoutInCell="1" allowOverlap="1" wp14:anchorId="4587E199" wp14:editId="3E58BEBD">
             <wp:simplePos x="0" y="0"/>
             <wp:positionH relativeFrom="column">
               <wp:posOffset>-187325</wp:posOffset>
@@ -4334,7 +4357,7 @@
           <w:noProof/>
         </w:rPr>
         <w:drawing>
-          <wp:anchor distT="0" distB="0" distL="114300" distR="114300" simplePos="0" relativeHeight="251718656" behindDoc="1" locked="0" layoutInCell="1" allowOverlap="1" wp14:anchorId="10738CAE" wp14:editId="6F542B39">
+          <wp:anchor distT="0" distB="0" distL="114300" distR="114300" simplePos="0" relativeHeight="251718656" behindDoc="1" locked="0" layoutInCell="1" allowOverlap="1" wp14:anchorId="10738CAE" wp14:editId="5E03441C">
             <wp:simplePos x="0" y="0"/>
             <wp:positionH relativeFrom="column">
               <wp:posOffset>-172085</wp:posOffset>
@@ -5267,7 +5290,7 @@
           <w:noProof/>
         </w:rPr>
         <w:drawing>
-          <wp:anchor distT="0" distB="0" distL="114300" distR="114300" simplePos="0" relativeHeight="251721728" behindDoc="1" locked="0" layoutInCell="1" allowOverlap="1" wp14:anchorId="55C9AEF8" wp14:editId="58533868">
+          <wp:anchor distT="0" distB="0" distL="114300" distR="114300" simplePos="0" relativeHeight="251721728" behindDoc="1" locked="0" layoutInCell="1" allowOverlap="1" wp14:anchorId="55C9AEF8" wp14:editId="3848DAEB">
             <wp:simplePos x="0" y="0"/>
             <wp:positionH relativeFrom="margin">
               <wp:align>left</wp:align>

</xml_diff>